<commit_message>
Títulos homologados de los informes por camino
</commit_message>
<xml_diff>
--- a/docs/03-licencias-medicas/versiones-anteriores/Informe_08-1-1_Camino_RPA_Marco_Legal.docx
+++ b/docs/03-licencias-medicas/versiones-anteriores/Informe_08-1-1_Camino_RPA_Marco_Legal.docx
@@ -62,7 +62,7 @@
           <w:sz w:val="80"/>
           <w:szCs w:val="80"/>
         </w:rPr>
-        <w:t xml:space="preserve">marco legal</w:t>
+        <w:t xml:space="preserve">· marco legal</w:t>
       </w:r>
     </w:p>
     <w:p>
@@ -1029,7 +1029,7 @@
                 <w:sz w:val="18"/>
                 <w:szCs w:val="18"/>
               </w:rPr>
-              <w:t xml:space="preserve">Informe 08.1.1 — Camino RPA (robot de software asistido): marco legal</w:t>
+              <w:t xml:space="preserve">Informe 08.1.1 — Camino RPA · marco legal</w:t>
             </w:r>
           </w:p>
         </w:tc>

</xml_diff>